<commit_message>
Update Healthcare Persistency Report – Magdalena Ivanova.docx
</commit_message>
<xml_diff>
--- a/week7/Healthcare Persistency Report – Magdalena Ivanova.docx
+++ b/week7/Healthcare Persistency Report – Magdalena Ivanova.docx
@@ -55,7 +55,7 @@
           <w:rFonts w:ascii="Calibri" w:hAnsi="Calibri" w:cs="Calibri"/>
         </w:rPr>
         <w:pict w14:anchorId="2EAFEAD3">
-          <v:rect id="_x0000_i1086" style="width:0;height:1.5pt" o:hralign="center" o:hrstd="t" o:hr="t" fillcolor="#a0a0a0" stroked="f"/>
+          <v:rect id="_x0000_i1025" style="width:0;height:1.5pt" o:hralign="center" o:hrstd="t" o:hr="t" fillcolor="#a0a0a0" stroked="f"/>
         </w:pict>
       </w:r>
     </w:p>
@@ -292,7 +292,7 @@
           <w:rFonts w:ascii="Calibri" w:hAnsi="Calibri" w:cs="Calibri"/>
         </w:rPr>
         <w:pict w14:anchorId="2DD070FA">
-          <v:rect id="_x0000_i1087" style="width:0;height:1.5pt" o:hralign="center" o:hrstd="t" o:hr="t" fillcolor="#a0a0a0" stroked="f"/>
+          <v:rect id="_x0000_i1026" style="width:0;height:1.5pt" o:hralign="center" o:hrstd="t" o:hr="t" fillcolor="#a0a0a0" stroked="f"/>
         </w:pict>
       </w:r>
     </w:p>
@@ -432,7 +432,7 @@
           <w:rFonts w:ascii="Calibri" w:hAnsi="Calibri" w:cs="Calibri"/>
         </w:rPr>
         <w:pict w14:anchorId="308AF5DF">
-          <v:rect id="_x0000_i1088" style="width:0;height:1.5pt" o:hralign="center" o:hrstd="t" o:hr="t" fillcolor="#a0a0a0" stroked="f"/>
+          <v:rect id="_x0000_i1027" style="width:0;height:1.5pt" o:hralign="center" o:hrstd="t" o:hr="t" fillcolor="#a0a0a0" stroked="f"/>
         </w:pict>
       </w:r>
     </w:p>
@@ -1017,7 +1017,7 @@
           <w:rFonts w:ascii="Calibri" w:hAnsi="Calibri" w:cs="Calibri"/>
         </w:rPr>
         <w:pict w14:anchorId="5E0737B0">
-          <v:rect id="_x0000_i1089" style="width:0;height:1.5pt" o:hralign="center" o:hrstd="t" o:hr="t" fillcolor="#a0a0a0" stroked="f"/>
+          <v:rect id="_x0000_i1028" style="width:0;height:1.5pt" o:hralign="center" o:hrstd="t" o:hr="t" fillcolor="#a0a0a0" stroked="f"/>
         </w:pict>
       </w:r>
     </w:p>
@@ -1179,7 +1179,7 @@
           <w:rFonts w:ascii="Calibri" w:hAnsi="Calibri" w:cs="Calibri"/>
         </w:rPr>
         <w:pict w14:anchorId="55F0464F">
-          <v:rect id="_x0000_i1090" style="width:0;height:1.5pt" o:hralign="center" o:hrstd="t" o:hr="t" fillcolor="#a0a0a0" stroked="f"/>
+          <v:rect id="_x0000_i1029" style="width:0;height:1.5pt" o:hralign="center" o:hrstd="t" o:hr="t" fillcolor="#a0a0a0" stroked="f"/>
         </w:pict>
       </w:r>
     </w:p>
@@ -1325,7 +1325,7 @@
           <w:rFonts w:ascii="Calibri" w:hAnsi="Calibri" w:cs="Calibri"/>
         </w:rPr>
         <w:pict w14:anchorId="7DC629B3">
-          <v:rect id="_x0000_i1091" style="width:0;height:1.5pt" o:hralign="center" o:hrstd="t" o:hr="t" fillcolor="#a0a0a0" stroked="f"/>
+          <v:rect id="_x0000_i1030" style="width:0;height:1.5pt" o:hralign="center" o:hrstd="t" o:hr="t" fillcolor="#a0a0a0" stroked="f"/>
         </w:pict>
       </w:r>
     </w:p>
@@ -1550,7 +1550,7 @@
           <w:rFonts w:ascii="Calibri" w:hAnsi="Calibri" w:cs="Calibri"/>
         </w:rPr>
         <w:pict w14:anchorId="363AB289">
-          <v:rect id="_x0000_i1092" style="width:0;height:1.5pt" o:hralign="center" o:hrstd="t" o:hr="t" fillcolor="#a0a0a0" stroked="f"/>
+          <v:rect id="_x0000_i1031" style="width:0;height:1.5pt" o:hralign="center" o:hrstd="t" o:hr="t" fillcolor="#a0a0a0" stroked="f"/>
         </w:pict>
       </w:r>
     </w:p>
@@ -1733,7 +1733,15 @@
           <w:b/>
           <w:bCs/>
         </w:rPr>
-        <w:t>Data Storage Location:</w:t>
+        <w:t>Data Storage Location</w:t>
+      </w:r>
+      <w:r>
+        <w:rPr>
+          <w:rFonts w:ascii="Calibri" w:hAnsi="Calibri" w:cs="Calibri"/>
+          <w:b/>
+          <w:bCs/>
+        </w:rPr>
+        <w:t>:</w:t>
       </w:r>
       <w:r>
         <w:rPr>
@@ -1741,6 +1749,15 @@
         </w:rPr>
         <w:t xml:space="preserve"> </w:t>
       </w:r>
+      <w:hyperlink r:id="rId5" w:history="1">
+        <w:r>
+          <w:rPr>
+            <w:rStyle w:val="Hyperlink"/>
+            <w:rFonts w:ascii="Calibri" w:hAnsi="Calibri" w:cs="Calibri"/>
+          </w:rPr>
+          <w:t>https://github.com/magdalena-ivanova-ds/Data-Glacier-Virtual-Internship/tree/main/week7</w:t>
+        </w:r>
+      </w:hyperlink>
     </w:p>
     <w:p>
       <w:pPr>
@@ -1871,6 +1888,7 @@
                 <w:b/>
                 <w:bCs/>
               </w:rPr>
+              <w:lastRenderedPageBreak/>
               <w:t>Total number of features</w:t>
             </w:r>
           </w:p>
@@ -1911,7 +1929,6 @@
                 <w:b/>
                 <w:bCs/>
               </w:rPr>
-              <w:lastRenderedPageBreak/>
               <w:t>Base format</w:t>
             </w:r>
           </w:p>
@@ -2028,7 +2045,7 @@
           <w:rFonts w:ascii="Calibri" w:hAnsi="Calibri" w:cs="Calibri"/>
         </w:rPr>
         <w:pict w14:anchorId="04E00B03">
-          <v:rect id="_x0000_i1093" style="width:0;height:1.5pt" o:hralign="center" o:hrstd="t" o:hr="t" fillcolor="#a0a0a0" stroked="f"/>
+          <v:rect id="_x0000_i1032" style="width:0;height:1.5pt" o:hralign="center" o:hrstd="t" o:hr="t" fillcolor="#a0a0a0" stroked="f"/>
         </w:pict>
       </w:r>
     </w:p>
@@ -2066,6 +2083,15 @@
           <w:rFonts w:ascii="Calibri" w:hAnsi="Calibri" w:cs="Calibri"/>
         </w:rPr>
       </w:pPr>
+      <w:hyperlink r:id="rId6" w:history="1">
+        <w:r>
+          <w:rPr>
+            <w:rStyle w:val="Hyperlink"/>
+            <w:rFonts w:ascii="Calibri" w:hAnsi="Calibri" w:cs="Calibri"/>
+          </w:rPr>
+          <w:t>https://github.com/magdalena-ivanova-ds/Data-Glacier-Virtual-Internship/tree/main/week7</w:t>
+        </w:r>
+      </w:hyperlink>
     </w:p>
     <w:sectPr>
       <w:pgSz w:w="11906" w:h="16838"/>
@@ -3489,6 +3515,7 @@
   <w:style w:type="character" w:default="1" w:styleId="DefaultParagraphFont">
     <w:name w:val="Default Paragraph Font"/>
     <w:uiPriority w:val="1"/>
+    <w:semiHidden/>
     <w:unhideWhenUsed/>
   </w:style>
   <w:style w:type="table" w:default="1" w:styleId="TableNormal">

</xml_diff>